<commit_message>
add lab 1 platform (docker, db, jwt etc.)
</commit_message>
<xml_diff>
--- a/docs/Lab1 - System Design (Платформа опитувань).docx
+++ b/docs/Lab1 - System Design (Платформа опитувань).docx
@@ -98,7 +98,7 @@
         <w:t>Стек технологій</w:t>
       </w:r>
       <w:r>
-        <w:t xml:space="preserve"> (заповнити після вибору):</w:t>
+        <w:t>:</w:t>
       </w:r>
     </w:p>
     <w:p>
@@ -106,7 +106,7 @@
         <w:pStyle w:val="ListBullet"/>
       </w:pPr>
       <w:r>
-        <w:t>Backend: тбд</w:t>
+        <w:t>Backend: C# / ASP.NET Core 10 (Web API на контролерах), EF Core 10 + Npgsql, FluentValidation, JWT Bearer, Swagger (Swashbuckle)</w:t>
       </w:r>
     </w:p>
     <w:p>
@@ -114,7 +114,7 @@
         <w:pStyle w:val="ListBullet"/>
       </w:pPr>
       <w:r>
-        <w:t>База даних: тбд</w:t>
+        <w:t>База даних: PostgreSQL 17 (схема — міграції EF Core, застосовуються автоматично при старті)</w:t>
       </w:r>
     </w:p>
     <w:p>
@@ -122,7 +122,7 @@
         <w:pStyle w:val="ListBullet"/>
       </w:pPr>
       <w:r>
-        <w:t>Кеш: тбд (опційно)</w:t>
+        <w:t>Кеш: у пам'яті процесу для MVP (лаба 1) → Redis (лаби 2, 4)</w:t>
       </w:r>
     </w:p>
     <w:p>
@@ -130,7 +130,7 @@
         <w:pStyle w:val="ListBullet"/>
       </w:pPr>
       <w:r>
-        <w:t>Черга повідомлень: тбд (опційно)</w:t>
+        <w:t>Черга повідомлень: у MVP не використовується; RabbitMQ — опційно для розширеної архітектури</w:t>
       </w:r>
     </w:p>
     <w:p>
@@ -2268,7 +2268,7 @@
         <w:pStyle w:val="ListBullet"/>
       </w:pPr>
       <w:r>
-        <w:t>Репозиторій: тбд (посилання на GitHub/GitLab)</w:t>
+        <w:t>Репозиторій: https://github.com/totalbyte/highload-system-practice</w:t>
       </w:r>
     </w:p>
     <w:p>
@@ -2276,7 +2276,7 @@
         <w:pStyle w:val="ListBullet"/>
       </w:pPr>
       <w:r>
-        <w:t>Swagger/OpenAPI: тбд (напр. /swagger-ui.html або файл openapi.yaml в репозиторії)</w:t>
+        <w:t>Swagger/OpenAPI: Swagger UI — http://localhost:8080/swagger, специфікація — /swagger/v1/swagger.json</w:t>
       </w:r>
     </w:p>
     <w:p>

</xml_diff>